<commit_message>
Reescribir introducción: importancia, caso, antecedentes y revisión teórica
Co-Authored-By: Claude Sonnet 5.5 <noreply@anthropic.com>
Claude-Session: https://claude.ai/code/session_011J7dwzCtzXnn49vmxE7n6v
</commit_message>
<xml_diff>
--- a/TIF-MIRIAM_zzz_APA7.docx
+++ b/TIF-MIRIAM_zzz_APA7.docx
@@ -473,7 +473,7 @@
         <w:pStyle w:val="APACuerpo"/>
       </w:pPr>
       <w:r>
-        <w:t xml:space="preserve">La somatización asociada al malestar emocional fue una problemática relevante para la salud mental de las mujeres adultas, pues interfería en su funcionamiento emocional, familiar y laboral cuando el sufrimiento psicológico no encontraba otras vías de expresión. Esto se presentaba cuando, frente a conflictos prolongados en la pareja y la familia, la persona manifestaba dolores corporales sin una explicación médica concluyente, acompañados de llanto, aislamiento, preocupación constante y alteraciones del sueño. Según el DSM-5-TR, los síntomas somáticos implican malestares físicos que afectan la vida diaria y se acompañan de pensamientos, sentimientos o conductas excesivas vinculadas a ellos (American Psychiatric Association [APA], 2022). A nivel mundial, la Organización Mundial de la Salud (OMS, 2021) estimó que casi una de cada tres mujeres había sufrido violencia física y/o sexual por parte de su pareja o violencia sexual por otra persona; en el Perú, la Encuesta Demográfica y de Salud Familiar (ENDES) 2024 reportó que el 52 % de las mujeres declaró haber sufrido violencia psicológica, física y/o sexual por parte de su pareja (Instituto Nacional de Estadística e Informática [INEI], 2025), y el Observatorio de Familia de la Universidad de Piura describió la violencia íntima de pareja como un problema prioritario de salud pública (Dulanto Rishing et al., 2026). En este escenario, las investigaciones señalaron que el sufrimiento en contextos de conflicto de pareja se expresó con frecuencia mediante síntomas depresivos, ansiosos y somáticos (Costales Zavgorodniaya y Argüello Yonfá, 2023; Pellón et al., 2024). Por ello, la presente investigación formativa se vinculó con el Objetivo de Desarrollo Sostenible (ODS) 3, Salud y bienestar, y con su meta 3.4, orientada a promover la salud mental y el bienestar. Frente a ello, el problema de investigación se formuló mediante la siguiente interrogante: ¿Cómo se manifestaron el malestar emocional y la sintomatología somática en una mujer adulta mediante el proceso de evaluación psicológica?</w:t>
+        <w:t xml:space="preserve">La somatización asociada al malestar emocional es un problema relevante para la salud mental de las mujeres adultas. Según el DSM-5-TR de la American Psychiatric Association (APA, 2022), los síntomas somáticos son malestares físicos que afectan la vida diaria y se acompañan de pensamientos, sentimientos o conductas excesivas vinculadas a ellos. Estos síntomas pueden surgir cuando el sufrimiento psicológico no encuentra otra vía de expresión, como en los conflictos prolongados de pareja. A nivel mundial, la Organización Mundial de la Salud (OMS, 2021) estimó que casi una de cada tres mujeres había sufrido violencia física o sexual. En el Perú, el Instituto Nacional de Estadística e Informática (INEI, 2025) reportó que el 52 % de las mujeres declaró violencia psicológica, física o sexual por parte de su pareja, y esta violencia se considera un problema prioritario de salud pública (Dulanto Rishing et al., 2026). Por ello, esta investigación contribuye al Objetivo de Desarrollo Sostenible 3, Salud y bienestar, en su meta 3.4, que busca promover la salud mental.</w:t>
       </w:r>
     </w:p>
     <w:p>
@@ -481,8 +481,7 @@
         <w:pStyle w:val="APACuerpo"/>
       </w:pPr>
       <w:r>
-        <w:t xml:space="preserve">Para responder a dicha interrogante, se estableció como objetivo general: describir el malestar emocional y la sintomatología somática de una mujer adulta en un contexto de conflicto conyugal y familiar mediante un proceso de evaluación psicológica. De manera complementaria, se plantearon como objetivos específicos: identificar los antecedentes familiares y personales relacionados con su malestar emocional; describir las características del conflicto conyugal y familiar actual; describir las </w:t>
-        <w:t>manifestaciones emocionales, somáticas y del sueño asociadas con dicho conflicto; y describir los recursos personales y factores contextuales que influyeron en su afrontamiento.</w:t>
+        <w:t xml:space="preserve">En consecuencia, se formuló el siguiente problema de investigación: ¿cómo se manifestaron el malestar emocional y la sintomatología somática en una mujer adulta de 55 años, con conflicto conyugal y familiar, atendida en un centro de salud de Trujillo?</w:t>
       </w:r>
     </w:p>
     <w:p>
@@ -490,15 +489,16 @@
         <w:pStyle w:val="APACuerpo"/>
       </w:pPr>
       <w:r>
-        <w:t>Desde una perspectiva teórica, la investigación se justificó porque permitió comprender cómo la exposición temprana a la violencia entre los padres, el abandono emocional y la infidelidad conyugal se articularon con la aparición de molestias corporales en una mujer adulta (Bernal, 2010). Desde una perspectiva práctica, ofreció información clínica útil para orientar la intervención psicológica de la evaluada y de mujeres con un perfil similar en servicios de salud del primer nivel, donde las quejas somáticas suelen abordarse solo desde lo médico, lo que retrasa la identificación de su componente emocional. Metodológicamente, se sustentó en el diseño de estudio de caso único según Montero y León (2002), articulando la entrevista psicológica, la anamnesis y la observación conductual como procedimientos para obtener información integral sobre el funcionamiento de la evaluada y para identificar la coocurrencia entre las emociones intensas y los síntomas físicos.</w:t>
+        <w:t xml:space="preserve">Desde lo teórico, el estudio permite comprender cómo la violencia vivida en la infancia, el abandono emocional y la infidelidad se relacionan con molestias corporales (Bernal, 2010). Desde lo práctico, ofrece información clínica para orientar la intervención de la evaluada y de otras mujeres con un perfil similar en el primer nivel de atención, donde estas molestias suelen abordarse solo desde lo médico. Finalmente, desde lo metodológico, el caso único (Montero y León, 2002) integra la entrevista, la anamnesis y la observación para identificar cuándo coinciden las emociones intensas con los síntomas físicos.</w:t>
       </w:r>
     </w:p>
     <w:p>
       <w:pPr>
         <w:pStyle w:val="APACuerpo"/>
-      </w:pPr>
-      <w:r>
-        <w:t>El proceso evaluativo se inició con la identificación de la evaluada, de iniciales M. R. C. H., de sexo femenino, de 55 años, natural de Cajamarca y residente en Trujillo, tercera de cinco hermanos, con instrucción superior en aviación comercial, casada, madre de tres hijos y dedicada a la venta de ropa por internet. La entrevista se realizó el 1 de octubre de 2026 en el Centro de Salud Unión. La evaluada se mostró amable y cordial y mantuvo contacto visual; sin embargo, al abordar su familia actual disminuyó el tono de voz y presentó tensión en los labios y dilatación pupilar.</w:t>
+        <w:pageBreakBefore/>
+      </w:pPr>
+      <w:r>
+        <w:t xml:space="preserve">La evaluada, de iniciales M. R. C. H., es una mujer de 55 años, natural de Cajamarca y residente en Trujillo. Tercera de cinco hermanos, cuenta con instrucción superior en aviación comercial, está casada y es madre de tres hijos. Actualmente se dedica a la venta de ropa por internet. La entrevista se realizó el 1 de octubre de 2026 en el Centro de Salud Unión. Durante la sesión se mostró amable y cordial, y mantuvo contacto visual; sin embargo, al hablar de su familia actual, bajó el tono de voz y presentó tensión en los labios y dilatación de las pupilas.</w:t>
       </w:r>
     </w:p>
     <w:p>
@@ -506,7 +506,7 @@
         <w:pStyle w:val="APACuerpo"/>
       </w:pPr>
       <w:r>
-        <w:t>En cuanto al motivo de consulta, la evaluada manifestó haber acudido por las dificultades entre su hija menor, de 17 años, y el padre de esta, que generaban conflictos constantes en el hogar. No obstante, su relato mostró que la demanda fue más amplia, pues incluyó un episodio de depresión posparto, tratado durante un año en Psicología y Psiquiatría, y su atención actual en Neuropsicología por dolor en el oído izquierdo, que se intensificaba solo de ese lado ante emociones fuertes. Así, la preocupación por la hija funcionó como puerta de entrada a un malestar propio, de mayor alcance.</w:t>
+        <w:t xml:space="preserve">Como motivo de consulta, refirió las dificultades entre su hija menor, de 17 años, y el padre de esta, que generaban conflictos constantes en el hogar. Sin embargo, su relato reveló una demanda más amplia, pues mencionó un episodio de depresión posparto, tratado durante un año en Psicología y Psiquiatría, y su atención actual en Neuropsicología por un dolor en el oído izquierdo, que se intensifica ante las emociones fuertes. Así, la preocupación por la hija fue la puerta de entrada a un malestar propio y de mayor alcance.</w:t>
       </w:r>
     </w:p>
     <w:p>
@@ -514,7 +514,7 @@
         <w:pStyle w:val="APACuerpo"/>
       </w:pPr>
       <w:r>
-        <w:t>El análisis del problema actual permitió identificar que este se originó cuando la evaluada y su hija dejaron Cajamarca, donde estaban emocionalmente estables y acompañadas por sus hermanas, para vivir en la casa del esposo en Trujillo. Allí, la menor no toleraba a su padre y este no se esforzaba por mejorar la relación; además, la evaluada se sintió inferior al saber que el esposo mantenía otra pareja, desarrolló una valoración negativa de sí misma y se arrepintió de la mudanza. Pese a ello, continuó la relación de manera privada y reiterada por su soledad, y comprendió con el tiempo que enfrentaba sola cualquier problema, pues el esposo solo estaba presente cuando deseaba intimidad. Hace seis meses cesaron el contacto físico y las insinuaciones, y la evaluada manifestó desinterés por intimar con él, lo cual coincidió con la intensificación de los problemas de oído, los dolores de cabeza y los mareos. Las conductas problema se manifestaron en lo emocional, con episodios de llanto y malestar general que ocupaban un día completo, sin lograr levantarse ni atender a sus clientes, y con aislamiento social; en lo somático, con dolor en el oído, cefalea y dolor del lado izquierdo del cuerpo, cuello y espalda, que aparecieron incluso durante la entrevista al recordar sus problemas familiares; en lo cognitivo, con olvidos recientes; y en el sueño, con descanso de seis horas aproximadamente, dificultad para conciliarlo por rumiación, pesadillas y un episodio de parálisis del sueño. Como afrontamiento, se bañaba hasta tres veces al día en situaciones de estrés y procuraba regular su respiración ante los mareos; asimismo, evitaba permanecer en casa cuando el esposo se encontraba presente y mantuvo discusiones exclusivamente verbales con la actual pareja de este. No refirió ideas de hacerse daño.</w:t>
+        <w:t xml:space="preserve">El problema actual se originó cuando la evaluada y su hija dejaron Cajamarca, donde se sentían estables y acompañadas por sus hermanas, para vivir en la casa del esposo en Trujillo. Allí, la hija no toleraba a su padre y este no se esforzaba por mejorar la relación. Además, al saber que el esposo tenía otra pareja, la evaluada se sintió inferior, desarrolló una valoración negativa de sí misma y se arrepintió de la mudanza. Aun así, mantuvo la relación en privado por su soledad y, con el tiempo, comprendió que enfrentaba sola los problemas, pues el esposo solo estaba presente cuando deseaba intimidad. Hace seis meses cesaron el contacto físico y las insinuaciones, y ella manifestó desinterés por intimar con él. Este cambio coincidió con el aumento de los problemas de oído, los dolores de cabeza y los mareos.</w:t>
       </w:r>
     </w:p>
     <w:p>
@@ -522,8 +522,7 @@
         <w:pStyle w:val="APACuerpo"/>
       </w:pPr>
       <w:r>
-        <w:t xml:space="preserve">En cuanto a los datos relevantes de la anamnesis, la historia familiar mostró una infancia triste en Cajamarca, marcada por el consumo excesivo de alcohol y la agresión física del padre hacia la madre ante los hijos, lo que llevó a la evaluada a ser una niña callada para evitar el castigo y a presentar dificultades de concentración y bajo rendimiento escolar. A los 10 años se trasladó a Trujillo con su madre tras la separación de sus padres. Ejerció su carrera de aviación comercial solo un año, pues la dejó al quedar embarazada y casarse muy joven, tras la promesa del esposo de que cuidaría de ella. Posteriormente, atravesó una depresión posparto con hospitalización de dos días, a lo que se sumó el fallecimiento de su padre, y el otorrinolaringólogo atribuyó sus síntomas a los nervios. En la actualidad, convive con su hija menor, su esposo, su suegra y sus excuñadas en un entorno donde no se </w:t>
-        <w:t>siente cómoda, y no se muda por limitaciones económicas; mantiene mayor cercanía con la hija menor y comunicación limitada con los dos hijos mayores. Finalmente, refirió que su relación de pareja se redujo con los años a encuentros únicamente íntimos, aceptados por su sentimiento de soledad.</w:t>
+        <w:t xml:space="preserve">Las conductas problema se presentaron en cuatro áreas. En lo emocional, tuvo episodios de llanto y malestar general que ocupaban un día completo, sin poder levantarse ni atender a sus clientes, junto con aislamiento social. En lo somático, refirió dolor de oído, cefalea y dolor en el lado izquierdo del cuerpo, el cuello y la espalda, molestias que aparecieron incluso durante la entrevista, al recordar sus problemas familiares. En lo cognitivo, mencionó olvidos recientes. En cuanto al sueño, descansaba unas seis horas, con dificultad para conciliarlo por rumiación, pesadillas y un episodio de parálisis del sueño. Para afrontar el estrés, se bañaba hasta tres veces al día, procuraba regular su respiración ante los mareos y evitaba permanecer en casa cuando estaba el esposo. Además, mantuvo discusiones solo verbales con la actual pareja de este. No refirió ideas de hacerse daño.</w:t>
       </w:r>
     </w:p>
     <w:p>
@@ -531,16 +530,16 @@
         <w:pStyle w:val="APACuerpo"/>
       </w:pPr>
       <w:r>
-        <w:t xml:space="preserve">En cuanto a la revisión de la literatura científica, los antecedentes recientes permitieron reconocer que los conflictos familiares y de pareja se relacionaron con el malestar emocional y su expresión corporal. Chung Pezo y Rayme Zumaeta (2025) revisaron ocho estudios publicados entre 2020 y 2025 y hallaron que la violencia doméstica en niños se asoció con ansiedad, depresión y estrés postraumático, junto con síntomas somáticos como mareos y dolores de cabeza; aunque su población fueron niños, el antecedente resulta pertinente porque la evaluada presentó exposición infantil a la violencia parental. Costales Zavgorodniaya y Argüello Yonfá (2023) estudiaron a 50 mujeres ecuatorianas víctimas de violencia de pareja y encontraron un cuadro ansioso-depresivo con quejas somáticas, aunque advirtieron resultados contradictorios y un instrumento no validado en esa población. Asimismo, Pellón et al. (2024) hallaron, en divorcios de alto conflicto, que las dificultades de ajuste se relacionaron con la somatización y que la ansiedad medió esa relación, si bien describieron su trabajo como preliminar. Bravo-Doddoli y Sánchez-Aragón (2021), con 204 parejas mexicanas, reportaron que el conflicto relacional y el estrés se asociaron con menor bienestar, y que las mujeres informaron más emociones negativas ante el estrés; sus resultados no debieron generalizarse al caso evaluado, pues una de las personas de cada pareja tenía una cardiopatía.</w:t>
+        <w:t xml:space="preserve">Entre los datos relevantes de la anamnesis, destaca una infancia triste en Cajamarca, marcada por el consumo excesivo de alcohol y la agresión física del padre hacia la madre frente a los hijos. Por ello, fue una niña callada para evitar el castigo, y tuvo dificultades de concentración y bajo rendimiento escolar. A los 10 años se trasladó a Trujillo con su madre, tras la separación de sus padres. Ejerció la aviación comercial solo un año, porque la dejó al quedar embarazada y casarse muy joven, con la promesa del esposo de que cuidaría de ella. Más adelante, atravesó una depresión posparto con dos días de hospitalización, a lo que se sumó el fallecimiento de su padre, y el otorrinolaringólogo atribuyó sus síntomas a los nervios. En la actualidad, convive con su hija menor, su esposo, su suegra y sus excuñadas en un entorno donde no se siente cómoda, y no se muda por limitaciones económicas. Se siente más cercana a la hija menor y mantiene poca comunicación con los dos hijos mayores. Finalmente, la relación con su esposo se redujo con los años a encuentros únicamente íntimos, que aceptaba por su soledad.</w:t>
       </w:r>
     </w:p>
     <w:p>
       <w:pPr>
         <w:pStyle w:val="APACuerpo"/>
-      </w:pPr>
-      <w:r>
-        <w:t xml:space="preserve">En cuanto a la infidelidad, Rosillo Ludeña y Muñoz Balbuca (2026) sintetizaron la evidencia sobre sus predictores y los agruparon en factores individuales (emocionales, interpersonales, de personalidad y contextuales) y relacionales (funcionamiento y estabilidad de la relación, afecto y patrones de interacción), además de describir modelos de intervención posteriores a ella, como la terapia cognitivo-conductual y la terapia de pareja centrada en las emociones. Por su parte, Yang et al. (2026), en una revisión narrativa, sintetizaron las vías por las cuales la exposición infantil a la violencia familiar se proyectó hacia la violencia en las relaciones de pareja durante la adultez. Además, Alva Pacheco et al. (2023) mapearon 19 estudios, en su mayoría peruanos, y 18 reportaron una relación significativa entre violencia y dependencia emocional, asociada con menor autoestima, depresión y ansiedad. </w:t>
-        <w:t>Respecto a la depresión posparto, Domeyko-Prieto et al. (2022) analizaron, en un diseño longitudinal, cómo el antecedente de depresión y los síntomas de estrés postraumático se relacionaron con los síntomas depresivos posparto, y si el apoyo social percibido moderaba dicha relación. Aunque varios estudios se centraron en mujeres víctimas de violencia, y en este caso no se reportó violencia física del esposo, sus hallazgos permitieron comprender la relación entre un vínculo conyugal deteriorado, la soledad afectiva y la expresión corporal del malestar.</w:t>
+        <w:pageBreakBefore/>
+      </w:pPr>
+      <w:r>
+        <w:t xml:space="preserve">Los antecedentes de investigación muestran que los conflictos de pareja y de familia se relacionan con el malestar emocional y con su expresión en el cuerpo. Costales Zavgorodniaya y Argüello Yonfá (2023) estudiaron a 50 mujeres ecuatorianas víctimas de violencia de pareja y encontraron un cuadro ansioso-depresivo con quejas somáticas, aunque advirtieron resultados contradictorios y el uso de un instrumento no validado en esa población. De forma similar, Pellón et al. (2024) observaron, en divorcios de alto conflicto, que las dificultades de ajuste se vinculaban con la somatización y que la ansiedad mediaba esa relación, si bien presentaron su trabajo como preliminar. Por su parte, Bravo-Doddoli y Sánchez-Aragón (2021) evaluaron a 204 parejas mexicanas y reportaron que el conflicto y el estrés se asociaban con menor bienestar, y que las mujeres informaban más emociones negativas ante el estrés. No obstante, estos resultados no pueden generalizarse al caso evaluado, pues en cada pareja una de las personas tenía una cardiopatía.</w:t>
       </w:r>
     </w:p>
     <w:p>
@@ -548,12 +547,29 @@
         <w:pStyle w:val="APACuerpo"/>
       </w:pPr>
       <w:r>
-        <w:t xml:space="preserve">Desde el sustento teórico, el caso se comprendió a partir del modelo transaccional del estrés, según el cual el estrés es una relación entre la persona y el entorno que esta evalúa como amenazante o superior a sus recursos, y el afrontamiento son los esfuerzos cognitivos y conductuales para manejar esas demandas (Martínez-Mejía, 2022). Desde esta perspectiva, la violencia parental en la infancia, la pérdida del soporte familiar al mudarse, la infidelidad del esposo y la dificultad económica para cambiar de domicilio pudieron configurar demandas valoradas como amenazantes, con escasos recursos de afrontamiento. La somatización, entendida como la expresión del malestar psicológico mediante síntomas físicos (APA, 2022; Costales Zavgorodniaya y Argüello Yonfá, 2023), permitió interpretar la otalgia, los mareos y el dolor del lado izquierdo ante emociones intensas, sin que ello implicara un diagnóstico. Por su parte, la dependencia emocional (Alva Pacheco et al., 2023) ayudó a explicar por qué la evaluada sostuvo durante años un vínculo que le generaba sufrimiento, motivada por la soledad, y la alteración del sueño se entendió como una consecuencia de la rumiación nocturna sobre sus preocupaciones familiares. En consecuencia, el análisis integral del caso permitió articular los antecedentes familiares, el conflicto conyugal, las manifestaciones corporales y emocionales y las alteraciones del sueño, y comprender que el malestar de la evaluada no se limitó a una dolencia del oído ni a la situación de su hija, sino que se vio acompañado por factores emocionales y familiares que influyeron en la expresión corporal de su sufrimiento. De esta manera, la evaluación psicológica permitió aproximarse a la comprensión del funcionamiento de la evaluada dentro de su contexto familiar y aportar información relevante para futuras acciones orientadas al fortalecimiento de su bienestar psicológico, de sus recursos personales y de sus estrategias para expresar y regular el malestar emocional sin recurrir exclusivamente a la vía corporal.</w:t>
+        <w:t xml:space="preserve">Otros estudios se centraron en la historia de vida. Chung Pezo y Rayme Zumaeta (2025) revisaron ocho estudios publicados entre 2020 y 2025 y hallaron que la violencia doméstica en la niñez se asocia con ansiedad, depresión y estrés postraumático, además de síntomas somáticos como mareos y dolores de cabeza. Aunque su población fueron niños, el antecedente es pertinente, pues la evaluada estuvo expuesta a la violencia entre sus padres. En la misma línea, Yang et al. (2026) sintetizaron, mediante una revisión narrativa, las vías por las cuales la exposición infantil a la violencia familiar se proyecta hacia la violencia en las relaciones de pareja adultas. A su vez, Alva Pacheco et al. (2023) mapearon 19 estudios, en su mayoría peruanos, de los cuales 18 reportaron una relación significativa entre la violencia y la dependencia emocional, vinculada con menor autoestima, depresión y ansiedad. En cuanto a la infidelidad, Rosillo Ludeña y Muñoz Balbuca (2026) agruparon sus predictores en factores individuales y relacionales, y describieron intervenciones posteriores, como la terapia cognitivo-conductual y la terapia de pareja centrada en las emociones. Finalmente, Domeyko-Prieto et al. (2022) analizaron, en un diseño longitudinal, cómo la depresión previa y los síntomas de estrés postraumático se relacionaban con la depresión posparto, y si el apoyo social percibido moderaba esa relación.</w:t>
+      </w:r>
+    </w:p>
+    <w:p>
+      <w:pPr>
+        <w:pStyle w:val="APACuerpo"/>
+      </w:pPr>
+      <w:r>
+        <w:t xml:space="preserve">En cuanto a la revisión teórica, el caso se comprende desde el modelo transaccional del estrés, según el cual el estrés es una relación entre la persona y su entorno, que ella evalúa como amenazante o superior a sus recursos. El afrontamiento, por su parte, son los esfuerzos cognitivos y conductuales para manejar esas demandas (Martínez-Mejía, 2022). Desde esta perspectiva, la violencia parental en la infancia, la pérdida del soporte familiar al mudarse, la infidelidad del esposo y la dificultad económica para cambiar de domicilio pudieron constituir demandas amenazantes, con pocos recursos para afrontarlas.</w:t>
+      </w:r>
+    </w:p>
+    <w:p>
+      <w:pPr>
+        <w:pStyle w:val="APACuerpo"/>
+      </w:pPr>
+      <w:r>
+        <w:t xml:space="preserve">La somatización, entendida como la expresión del malestar psicológico mediante síntomas físicos (APA, 2022; Costales Zavgorodniaya y Argüello Yonfá, 2023), permite interpretar el dolor de oído, los mareos y el dolor del lado izquierdo ante emociones intensas, sin que ello implique un diagnóstico. Asimismo, la dependencia emocional (Alva Pacheco et al., 2023) ayuda a explicar por qué la evaluada sostuvo durante años un vínculo que le causaba sufrimiento, motivada por la soledad. Por último, la alteración del sueño se entiende como consecuencia de la rumiación nocturna sobre sus preocupaciones familiares.</w:t>
       </w:r>
     </w:p>
     <w:p>
       <w:pPr>
         <w:pStyle w:val="Ttulo1"/>
+        <w:pageBreakBefore/>
       </w:pPr>
       <w:r>
         <w:t xml:space="preserve">Metodología</w:t>

</xml_diff>

<commit_message>
Ajustar redacción para evitar lenguaje diagnóstico
Co-Authored-By: Claude Sonnet 5.5 <noreply@anthropic.com>
Claude-Session: https://claude.ai/code/session_011J7dwzCtzXnn49vmxE7n6v
</commit_message>
<xml_diff>
--- a/TIF-MIRIAM_zzz_APA7.docx
+++ b/TIF-MIRIAM_zzz_APA7.docx
@@ -530,7 +530,7 @@
         <w:pStyle w:val="APACuerpo"/>
       </w:pPr>
       <w:r>
-        <w:t xml:space="preserve">Entre los datos relevantes de la anamnesis, destaca una infancia triste en Cajamarca, marcada por el consumo excesivo de alcohol y la agresión física del padre hacia la madre frente a los hijos. Por ello, fue una niña callada para evitar el castigo, y tuvo dificultades de concentración y bajo rendimiento escolar. A los 10 años se trasladó a Trujillo con su madre, tras la separación de sus padres. Ejerció la aviación comercial solo un año, porque la dejó al quedar embarazada y casarse muy joven, con la promesa del esposo de que cuidaría de ella. Más adelante, atravesó una depresión posparto con dos días de hospitalización, a lo que se sumó el fallecimiento de su padre, y el otorrinolaringólogo atribuyó sus síntomas a los nervios. En la actualidad, convive con su hija menor, su esposo, su suegra y sus excuñadas en un entorno donde no se siente cómoda, y no se muda por limitaciones económicas. Se siente más cercana a la hija menor y mantiene poca comunicación con los dos hijos mayores. Finalmente, la relación con su esposo se redujo con los años a encuentros únicamente íntimos, que aceptaba por su soledad.</w:t>
+        <w:t xml:space="preserve">Entre los datos relevantes de la anamnesis, destaca una infancia triste en Cajamarca, marcada por el consumo excesivo de alcohol y la agresión física del padre hacia la madre frente a los hijos. Por ello, según refirió, fue una niña callada para evitar el castigo, y tuvo dificultades de concentración y bajo rendimiento escolar. A los 10 años se trasladó a Trujillo con su madre, tras la separación de sus padres. Ejerció la aviación comercial solo un año, porque la dejó al quedar embarazada y casarse muy joven, con la promesa del esposo de que cuidaría de ella. Más adelante, atravesó una depresión posparto con dos días de hospitalización, a lo que se sumó el fallecimiento de su padre, y el otorrinolaringólogo atribuyó sus síntomas a los nervios. En la actualidad, convive con su hija menor, su esposo, su suegra y sus excuñadas en un entorno donde no se siente cómoda, y no se muda por limitaciones económicas. Se siente más cercana a la hija menor y mantiene poca comunicación con los dos hijos mayores. Finalmente, la relación con su esposo se redujo con los años a encuentros únicamente íntimos, que aceptaba por su soledad.</w:t>
       </w:r>
     </w:p>
     <w:p>
@@ -563,7 +563,7 @@
         <w:pStyle w:val="APACuerpo"/>
       </w:pPr>
       <w:r>
-        <w:t xml:space="preserve">La somatización, entendida como la expresión del malestar psicológico mediante síntomas físicos (APA, 2022; Costales Zavgorodniaya y Argüello Yonfá, 2023), permite interpretar el dolor de oído, los mareos y el dolor del lado izquierdo ante emociones intensas, sin que ello implique un diagnóstico. Asimismo, la dependencia emocional (Alva Pacheco et al., 2023) ayuda a explicar por qué la evaluada sostuvo durante años un vínculo que le causaba sufrimiento, motivada por la soledad. Por último, la alteración del sueño se entiende como consecuencia de la rumiación nocturna sobre sus preocupaciones familiares.</w:t>
+        <w:t xml:space="preserve">La somatización, entendida como la expresión del malestar psicológico mediante síntomas físicos (APA, 2022; Costales Zavgorodniaya y Argüello Yonfá, 2023), permite comprender el dolor de oído, los mareos y el dolor del lado izquierdo ante emociones intensas. Asimismo, la dependencia emocional (Alva Pacheco et al., 2023) es un concepto útil para comprender por qué la evaluada mantuvo durante años un vínculo que le causaba sufrimiento, en un contexto de soledad. Por último, las dificultades del sueño pueden comprenderse en relación con la rumiación nocturna sobre sus preocupaciones familiares. Estos conceptos orientan la comprensión del caso y no constituyen un diagnóstico.</w:t>
       </w:r>
     </w:p>
     <w:p>

</xml_diff>

<commit_message>
Referencias: omitir editorial cuando coincide con el autor (APA 7)
Co-Authored-By: Claude Sonnet 5.5 <noreply@anthropic.com>
Claude-Session: https://claude.ai/code/session_011J7dwzCtzXnn49vmxE7n6v
</commit_message>
<xml_diff>
--- a/TIF-MIRIAM_zzz_APA7.docx
+++ b/TIF-MIRIAM_zzz_APA7.docx
@@ -725,7 +725,7 @@
         <w:t xml:space="preserve">Diagnostic and statistical manual of mental disorders</w:t>
       </w:r>
       <w:r>
-        <w:t xml:space="preserve"> (5th ed., text rev.). APA. </w:t>
+        <w:t xml:space="preserve"> (5th ed., text rev.). </w:t>
       </w:r>
       <w:hyperlink r:id="rId106" w:history="1">
         <w:r>
@@ -751,7 +751,7 @@
         <w:t xml:space="preserve">Ethical principles of psychologists and code of conduct</w:t>
       </w:r>
       <w:r>
-        <w:t xml:space="preserve"> (2002, enmendado en 2010 y 2017). APA. </w:t>
+        <w:t xml:space="preserve"> (2002, enmendado en 2010 y 2017). </w:t>
       </w:r>
       <w:hyperlink r:id="rId107" w:history="1">
         <w:r>
@@ -891,7 +891,7 @@
         <w:t xml:space="preserve">Código de ética</w:t>
       </w:r>
       <w:r>
-        <w:t xml:space="preserve">. CPsP. </w:t>
+        <w:t xml:space="preserve">. </w:t>
       </w:r>
       <w:hyperlink r:id="rId111" w:history="1">
         <w:r>
@@ -1057,7 +1057,7 @@
         <w:t xml:space="preserve">Encuesta Demográfica y de Salud Familiar (ENDES) 2024</w:t>
       </w:r>
       <w:r>
-        <w:t xml:space="preserve">. INEI.</w:t>
+        <w:t xml:space="preserve">.</w:t>
       </w:r>
     </w:p>
     <w:p>
@@ -1127,7 +1127,7 @@
         <w:t xml:space="preserve">Violence against women prevalence estimates, 2018: Global, regional and national prevalence estimates for intimate partner violence against women and global and regional prevalence estimates for non-partner sexual violence against women</w:t>
       </w:r>
       <w:r>
-        <w:t xml:space="preserve">. OMS.</w:t>
+        <w:t xml:space="preserve">.</w:t>
       </w:r>
     </w:p>
     <w:p>
@@ -1215,7 +1215,7 @@
         <w:t xml:space="preserve">Código de ética en investigación</w:t>
       </w:r>
       <w:r>
-        <w:t xml:space="preserve"> (Versión 02) [Resolución de Consejo Universitario N.º 0659-2024/UCV]. UCV.</w:t>
+        <w:t xml:space="preserve"> (Versión 02) [Resolución de Consejo Universitario N.º 0659-2024/UCV].</w:t>
       </w:r>
     </w:p>
     <w:p>

</xml_diff>